<commit_message>
Vendor letter: condense to a single page
Merged the To/From/Date onto one line, trimmed the intro to one sentence,
tightened the confirmations, shortened the callout, and reduced signature-block
and footer spacing. Word now paginates it at 1 page (was just over onto 2).
</commit_message>
<xml_diff>
--- a/public/downloads/Vendor-AI-Agreement-Letter.docx
+++ b/public/downloads/Vendor-AI-Agreement-Letter.docx
@@ -57,15 +57,15 @@
     </w:p>
     <w:p>
       <w:pPr>
-        <w:spacing w:after="220"/>
+        <w:spacing w:after="140"/>
       </w:pPr>
       <w:r>
         <w:rPr>
           <w:b/>
           <w:bCs/>
           <w:color w:val="0B2440"/>
-          <w:sz w:val="32"/>
-          <w:szCs w:val="32"/>
+          <w:sz w:val="28"/>
+          <w:szCs w:val="28"/>
           <w:rFonts w:ascii="Calibri" w:cs="Calibri" w:eastAsia="Calibri" w:hAnsi="Calibri"/>
         </w:rPr>
         <w:t xml:space="preserve">AI Data-Handling Commitment for Vendors</w:t>
@@ -73,7 +73,7 @@
     </w:p>
     <w:p>
       <w:pPr>
-        <w:spacing w:after="140" w:line="276" w:before="0"/>
+        <w:spacing w:after="90" w:line="276" w:before="0"/>
       </w:pPr>
       <w:r>
         <w:rPr>
@@ -95,11 +95,6 @@
         </w:rPr>
         <w:t xml:space="preserve">[Vendor / company name]</w:t>
       </w:r>
-    </w:p>
-    <w:p>
-      <w:pPr>
-        <w:spacing w:after="140" w:line="276" w:before="0"/>
-      </w:pPr>
       <w:r>
         <w:rPr>
           <w:color w:val="6B7C8B"/>
@@ -107,7 +102,7 @@
           <w:szCs w:val="21"/>
           <w:rFonts w:ascii="Calibri" w:cs="Calibri" w:eastAsia="Calibri" w:hAnsi="Calibri"/>
         </w:rPr>
-        <w:t xml:space="preserve">From  </w:t>
+        <w:t xml:space="preserve">        From  </w:t>
       </w:r>
       <w:r>
         <w:rPr>
@@ -127,7 +122,7 @@
           <w:szCs w:val="21"/>
           <w:rFonts w:ascii="Calibri" w:cs="Calibri" w:eastAsia="Calibri" w:hAnsi="Calibri"/>
         </w:rPr>
-        <w:t xml:space="preserve">       Date  </w:t>
+        <w:t xml:space="preserve">        Date  </w:t>
       </w:r>
       <w:r>
         <w:rPr>
@@ -143,7 +138,7 @@
     </w:p>
     <w:p>
       <w:pPr>
-        <w:spacing w:after="140" w:line="276" w:before="0"/>
+        <w:spacing w:after="110" w:line="276" w:before="0"/>
       </w:pPr>
       <w:r>
         <w:rPr>
@@ -152,21 +147,20 @@
           <w:szCs w:val="21"/>
           <w:rFonts w:ascii="Calibri" w:cs="Calibri" w:eastAsia="Calibri" w:hAnsi="Calibri"/>
         </w:rPr>
-        <w:t xml:space="preserve">As a partner who handles our data, we are asking you to confirm how that data is protected when artificial intelligence is involved. This is the one exposure almost nobody has closed on paper, and it is the easiest to close. Please review the commitments below and have an authorized representative sign.</w:t>
-      </w:r>
-    </w:p>
-    <w:p>
-      <w:pPr>
-        <w:pStyle w:val="Heading2"/>
-        <w:spacing w:before="260" w:after="90"/>
+        <w:t xml:space="preserve">As a partner who handles our data, please confirm how that data is protected when AI is involved, then have an authorized representative sign below.</w:t>
+      </w:r>
+    </w:p>
+    <w:p>
+      <w:pPr>
+        <w:spacing w:before="40" w:after="70"/>
       </w:pPr>
       <w:r>
         <w:rPr>
           <w:b/>
           <w:bCs/>
           <w:color w:val="0B2440"/>
-          <w:sz w:val="24"/>
-          <w:szCs w:val="24"/>
+          <w:sz w:val="21"/>
+          <w:szCs w:val="21"/>
           <w:rFonts w:ascii="Calibri" w:cs="Calibri" w:eastAsia="Calibri" w:hAnsi="Calibri"/>
         </w:rPr>
         <w:t xml:space="preserve">On behalf of our organization, we confirm that we:</w:t>
@@ -179,7 +173,7 @@
           <w:ilvl w:val="0"/>
           <w:numId w:val="2"/>
         </w:numPr>
-        <w:spacing w:after="90" w:line="272"/>
+        <w:spacing w:after="60" w:line="264"/>
       </w:pPr>
       <w:r>
         <w:rPr>
@@ -209,7 +203,7 @@
           <w:ilvl w:val="0"/>
           <w:numId w:val="2"/>
         </w:numPr>
-        <w:spacing w:after="90" w:line="272"/>
+        <w:spacing w:after="60" w:line="264"/>
       </w:pPr>
       <w:r>
         <w:rPr>
@@ -228,7 +222,7 @@
           <w:ilvl w:val="0"/>
           <w:numId w:val="2"/>
         </w:numPr>
-        <w:spacing w:after="90" w:line="272"/>
+        <w:spacing w:after="60" w:line="264"/>
       </w:pPr>
       <w:r>
         <w:rPr>
@@ -247,7 +241,7 @@
           <w:ilvl w:val="0"/>
           <w:numId w:val="2"/>
         </w:numPr>
-        <w:spacing w:after="90" w:line="272"/>
+        <w:spacing w:after="60" w:line="264"/>
       </w:pPr>
       <w:r>
         <w:rPr>
@@ -266,7 +260,7 @@
           <w:ilvl w:val="0"/>
           <w:numId w:val="2"/>
         </w:numPr>
-        <w:spacing w:after="90" w:line="272"/>
+        <w:spacing w:after="60" w:line="264"/>
       </w:pPr>
       <w:r>
         <w:rPr>
@@ -275,7 +269,7 @@
           <w:szCs w:val="21"/>
           <w:rFonts w:ascii="Calibri" w:cs="Calibri" w:eastAsia="Calibri" w:hAnsi="Calibri"/>
         </w:rPr>
-        <w:t xml:space="preserve">Will store and process your data in accordance with your data-residency requirements ([e.g., United States only]).</w:t>
+        <w:t xml:space="preserve">Will store and process your data per your data-residency requirements ([e.g., United States only]).</w:t>
       </w:r>
     </w:p>
     <w:p>
@@ -285,7 +279,7 @@
           <w:ilvl w:val="0"/>
           <w:numId w:val="2"/>
         </w:numPr>
-        <w:spacing w:after="90" w:line="272"/>
+        <w:spacing w:after="60" w:line="264"/>
       </w:pPr>
       <w:r>
         <w:rPr>
@@ -294,7 +288,7 @@
           <w:szCs w:val="21"/>
           <w:rFonts w:ascii="Calibri" w:cs="Calibri" w:eastAsia="Calibri" w:hAnsi="Calibri"/>
         </w:rPr>
-        <w:t xml:space="preserve">Maintain appropriate safeguards and, where required, the necessary agreements (such as a HIPAA Business Associate Agreement) before processing regulated data.</w:t>
+        <w:t xml:space="preserve">Maintain appropriate safeguards and, where required, agreements (such as a HIPAA BAA) before processing regulated data.</w:t>
       </w:r>
     </w:p>
     <w:p>
@@ -304,7 +298,7 @@
           <w:ilvl w:val="0"/>
           <w:numId w:val="2"/>
         </w:numPr>
-        <w:spacing w:after="90" w:line="272"/>
+        <w:spacing w:after="60" w:line="264"/>
       </w:pPr>
       <w:r>
         <w:rPr>
@@ -313,7 +307,7 @@
           <w:szCs w:val="21"/>
           <w:rFonts w:ascii="Calibri" w:cs="Calibri" w:eastAsia="Calibri" w:hAnsi="Calibri"/>
         </w:rPr>
-        <w:t xml:space="preserve">Will notify you promptly of any incident involving AI and your data, and will require our own subcontractors to meet these same commitments.</w:t>
+        <w:t xml:space="preserve">Will notify you promptly of any AI-related incident involving your data, and require our subcontractors to meet these same commitments.</w:t>
       </w:r>
     </w:p>
     <w:tbl>
@@ -372,7 +366,7 @@
                 <w:szCs w:val="21"/>
                 <w:rFonts w:ascii="Calibri" w:cs="Calibri" w:eastAsia="Calibri" w:hAnsi="Calibri"/>
               </w:rPr>
-              <w:t xml:space="preserve">When a contractor or vendor runs client data, financials, or IP through an AI tool, the liability for an exposure usually flows back to the data owner. A written commitment protects both of us, and demonstrates the diligence our clients and insurers expect.</w:t>
+              <w:t xml:space="preserve">When a vendor runs client data, financials, or IP through an AI tool, the liability usually flows back to the data owner. This commitment protects both of us and shows the diligence clients and insurers expect.</w:t>
             </w:r>
           </w:p>
         </w:tc>
@@ -380,15 +374,15 @@
     </w:tbl>
     <w:p>
       <w:pPr>
-        <w:spacing w:before="260" w:after="0"/>
+        <w:spacing w:before="150" w:after="0"/>
       </w:pPr>
       <w:r>
         <w:rPr>
           <w:b/>
           <w:bCs/>
           <w:color w:val="0B2440"/>
-          <w:sz w:val="20"/>
-          <w:szCs w:val="20"/>
+          <w:sz w:val="19"/>
+          <w:szCs w:val="19"/>
           <w:rFonts w:ascii="Calibri" w:cs="Calibri" w:eastAsia="Calibri" w:hAnsi="Calibri"/>
         </w:rPr>
         <w:t xml:space="preserve">Authorized representative</w:t>
@@ -399,7 +393,7 @@
         <w:pBdr>
           <w:bottom w:val="single" w:color="0C1622" w:sz="4"/>
         </w:pBdr>
-        <w:spacing w:before="260" w:after="0"/>
+        <w:spacing w:before="190" w:after="0"/>
       </w:pPr>
       <w:r>
         <w:rPr>
@@ -413,13 +407,13 @@
     </w:p>
     <w:p>
       <w:pPr>
-        <w:spacing w:after="40"/>
+        <w:spacing w:after="30"/>
       </w:pPr>
       <w:r>
         <w:rPr>
           <w:color w:val="6B7C8B"/>
-          <w:sz w:val="18"/>
-          <w:szCs w:val="18"/>
+          <w:sz w:val="17"/>
+          <w:szCs w:val="17"/>
           <w:rFonts w:ascii="Calibri" w:cs="Calibri" w:eastAsia="Calibri" w:hAnsi="Calibri"/>
         </w:rPr>
         <w:t xml:space="preserve">Name &amp; title (print)</w:t>
@@ -430,7 +424,7 @@
         <w:pBdr>
           <w:bottom w:val="single" w:color="0C1622" w:sz="4"/>
         </w:pBdr>
-        <w:spacing w:before="300" w:after="0"/>
+        <w:spacing w:before="190" w:after="0"/>
       </w:pPr>
       <w:r>
         <w:rPr>
@@ -444,13 +438,13 @@
     </w:p>
     <w:p>
       <w:pPr>
-        <w:spacing w:after="40"/>
+        <w:spacing w:after="30"/>
       </w:pPr>
       <w:r>
         <w:rPr>
           <w:color w:val="6B7C8B"/>
-          <w:sz w:val="18"/>
-          <w:szCs w:val="18"/>
+          <w:sz w:val="17"/>
+          <w:szCs w:val="17"/>
           <w:rFonts w:ascii="Calibri" w:cs="Calibri" w:eastAsia="Calibri" w:hAnsi="Calibri"/>
         </w:rPr>
         <w:t xml:space="preserve">Company</w:t>
@@ -458,13 +452,13 @@
     </w:p>
     <w:p>
       <w:pPr>
-        <w:spacing w:before="300" w:after="0"/>
+        <w:spacing w:before="190" w:after="0"/>
       </w:pPr>
       <w:r>
         <w:rPr>
           <w:color w:val="6B7C8B"/>
-          <w:sz w:val="18"/>
-          <w:szCs w:val="18"/>
+          <w:sz w:val="17"/>
+          <w:szCs w:val="17"/>
           <w:rFonts w:ascii="Calibri" w:cs="Calibri" w:eastAsia="Calibri" w:hAnsi="Calibri"/>
         </w:rPr>
         <w:t xml:space="preserve">Signature</w:t>
@@ -472,8 +466,8 @@
       <w:r>
         <w:rPr>
           <w:color w:val="6B7C8B"/>
-          <w:sz w:val="18"/>
-          <w:szCs w:val="18"/>
+          <w:sz w:val="17"/>
+          <w:szCs w:val="17"/>
           <w:rFonts w:ascii="Calibri" w:cs="Calibri" w:eastAsia="Calibri" w:hAnsi="Calibri"/>
         </w:rPr>
         <w:ptab w:alignment="right" w:relativeTo="margin" w:leader="none"/>
@@ -481,8 +475,8 @@
       <w:r>
         <w:rPr>
           <w:color w:val="6B7C8B"/>
-          <w:sz w:val="18"/>
-          <w:szCs w:val="18"/>
+          <w:sz w:val="17"/>
+          <w:szCs w:val="17"/>
           <w:rFonts w:ascii="Calibri" w:cs="Calibri" w:eastAsia="Calibri" w:hAnsi="Calibri"/>
         </w:rPr>
         <w:t xml:space="preserve">Date</w:t>
@@ -493,7 +487,7 @@
         <w:pBdr>
           <w:bottom w:val="single" w:color="0C1622" w:sz="4"/>
         </w:pBdr>
-        <w:spacing w:before="300"/>
+        <w:spacing w:before="190" w:after="0"/>
       </w:pPr>
       <w:r>
         <w:rPr>
@@ -517,15 +511,15 @@
         <w:pBdr>
           <w:top w:val="single" w:color="DCE4EA" w:sz="2"/>
         </w:pBdr>
-        <w:spacing w:before="500"/>
+        <w:spacing w:before="200"/>
       </w:pPr>
       <w:r>
         <w:rPr>
           <w:i/>
           <w:iCs/>
           <w:color w:val="6B7C8B"/>
-          <w:sz w:val="17"/>
-          <w:szCs w:val="17"/>
+          <w:sz w:val="15"/>
+          <w:szCs w:val="15"/>
           <w:rFonts w:ascii="Calibri" w:cs="Calibri" w:eastAsia="Calibri" w:hAnsi="Calibri"/>
         </w:rPr>
         <w:t xml:space="preserve">Template — a starting point, not legal advice. Review with your legal team and confirm it meets your organization’s requirements before use. Issued August 18, 2026 · review monthly · Provided by Fortify AI.</w:t>

</xml_diff>